<commit_message>
docs(database): add the sport package and membership card tables to the ERD
</commit_message>
<xml_diff>
--- a/docs/database/ERD_Explanation.docx
+++ b/docs/database/ERD_Explanation.docx
@@ -43,12 +43,12 @@
     </w:p>
     <w:p>
       <w:r>
-        <w:t>- Các bảng chính: sport, membership_plan, membership, check_in</w:t>
+        <w:t>- Các bảng chính: sport, sport_package, sport_package_registration, membership_card_tier, member_card, refund_request, check_in (các bảng cũ membership_plan, plan_eligible_sport, plan_feature, membership, membership_sport giữ lại ở chế độ LEGACY)</w:t>
       </w:r>
     </w:p>
     <w:p>
       <w:r>
-        <w:t>- Giải thích: Các gói tập (membership_plan) quy định giá tiền, thời hạn và số lượng môn thể thao tối đa được chọn. Khi học viên đăng ký hoặc gia hạn, hệ thống sẽ tạo ra một dòng membership mới để lưu giữ lịch sử và trạng thái. Lịch sử check-in tại quầy lễ tân được lưu tại bảng check_in.</w:t>
+        <w:t>- Giải thích: Hệ thống quản lý các gói tập (sport_package) theo từng môn thể thao, hình thức đào tạo (tự tập SELF_TRAINING hoặc có HLV COACH_LED), thời hạn (ngày) và số buổi. Học viên đăng ký gói tập thông qua sport_package_registration. Thẻ hội viên (member_card) gắn với hạng thẻ (membership_card_tier: STANDARD 0%, GOLD 5%, VIP 10%) áp dụng giảm giá khi mua gói tập. Quy trình yêu cầu hoàn tiền được ghi nhận tại refund_request. Lịch sử check-in tại quầy lễ tân được ghi nhận tại bảng check_in, liên kết trực tiếp với lịch đặt chỗ (booking) và gói tập của học viên.</w:t>
       </w:r>
     </w:p>
     <w:p>
@@ -66,7 +66,7 @@
     </w:p>
     <w:p>
       <w:r>
-        <w:t>- Giải thích: sport_class đại diện cho khuôn mẫu của một lớp học, trong khi class_session là các buổi học cụ thể diễn ra vào một ngày và giờ nhất định. Học viên sẽ tạo booking để giữ chỗ trong class_session. Nếu lớp đã đầy, học viên được đưa vào waitlist_entry để chờ xếp hạng.</w:t>
+        <w:t>- Giải thích: sport_class đại diện cho khuôn mẫu của một lớp học, trong khi class_session là các buổi học cụ thể diễn ra vào một ngày và giờ nhất định (bao gồm buổi có HLV và buổi tự tập). Học viên sẽ tạo booking liên kết với gói tập (sport_package_registration) để giữ chỗ trong class_session. Nếu lớp đã đầy, học viên có thể vào hàng đợi waitlist_entry (tính năng dự kiến).</w:t>
       </w:r>
     </w:p>
     <w:p>

</xml_diff>